<commit_message>
research: complete XLS-R main, RQ2, Benchmark V2 eval, and doc regeneration
Co-authored-by: Cursor <cursoragent@cursor.com>
</commit_message>
<xml_diff>
--- a/docs/VaaniQ_Midterm_Progress_Report.docx
+++ b/docs/VaaniQ_Midterm_Progress_Report.docx
@@ -35,18 +35,18 @@
       </w:pPr>
       <w:r>
         <w:br/>
-        <w:t>Gaurav Phadale — 70022300092</w:t>
+        <w:t>Gaurav Phadale  70022300092</w:t>
         <w:br/>
-        <w:t>Eshaan Sarkhawas — 70022300066</w:t>
+        <w:t>Eshaan Sarkhawas  70022300066</w:t>
         <w:br/>
-        <w:t>Aarav Phutane — 70022300152</w:t>
+        <w:t>Aarav Phutane  70022300152</w:t>
         <w:br/>
-        <w:t>Prajwal Patil — 70022300213</w:t>
+        <w:t>Prajwal Patil  70022300213</w:t>
         <w:br/>
         <w:br/>
         <w:t>Faculty Guide: Prof. Rama Bharti Varshney</w:t>
         <w:br/>
-        <w:t>MPSTME, NMIMS · Academic Year 2026-27</w:t>
+        <w:t>MPSTME, NMIMS  Academic Year 2026-27</w:t>
       </w:r>
     </w:p>
     <w:p>
@@ -241,7 +241,7 @@
                 <w:b w:val="0"/>
                 <w:sz w:val="15"/>
               </w:rPr>
-              <w:t>n=584; accuracy 93.7%; EER 6.6%</w:t>
+              <w:t>n=584; accuracy 91.6%; EER 6.6%</w:t>
             </w:r>
           </w:p>
         </w:tc>
@@ -1023,7 +1023,7 @@
                 <w:b w:val="0"/>
                 <w:sz w:val="15"/>
               </w:rPr>
-              <w:t>93.7%</w:t>
+              <w:t>91.0%</w:t>
             </w:r>
           </w:p>
         </w:tc>
@@ -1041,7 +1041,7 @@
                 <w:b w:val="0"/>
                 <w:sz w:val="15"/>
               </w:rPr>
-              <w:t>5.6%</w:t>
+              <w:t>7.0%</w:t>
             </w:r>
           </w:p>
         </w:tc>
@@ -1115,7 +1115,7 @@
                 <w:b w:val="0"/>
                 <w:sz w:val="15"/>
               </w:rPr>
-              <w:t>93.9%</w:t>
+              <w:t>93.3%</w:t>
             </w:r>
           </w:p>
         </w:tc>
@@ -1207,7 +1207,7 @@
                 <w:b w:val="0"/>
                 <w:sz w:val="15"/>
               </w:rPr>
-              <w:t>93.4%</w:t>
+              <w:t>90.9%</w:t>
             </w:r>
           </w:p>
         </w:tc>
@@ -1332,7 +1332,7 @@
                 <w:b w:val="0"/>
                 <w:sz w:val="15"/>
               </w:rPr>
-              <w:t>93.66%</w:t>
+              <w:t>91.61%</w:t>
             </w:r>
           </w:p>
         </w:tc>
@@ -1370,7 +1370,7 @@
                 <w:b w:val="0"/>
                 <w:sz w:val="15"/>
               </w:rPr>
-              <w:t>89.82%</w:t>
+              <w:t>85.48%</w:t>
             </w:r>
           </w:p>
         </w:tc>
@@ -1408,7 +1408,7 @@
                 <w:b w:val="0"/>
                 <w:sz w:val="15"/>
               </w:rPr>
-              <w:t>96.97%</w:t>
+              <w:t>98.11%</w:t>
             </w:r>
           </w:p>
         </w:tc>
@@ -1446,7 +1446,7 @@
                 <w:b w:val="0"/>
                 <w:sz w:val="15"/>
               </w:rPr>
-              <w:t>93.26%</w:t>
+              <w:t>91.36%</w:t>
             </w:r>
           </w:p>
         </w:tc>
@@ -1522,7 +1522,7 @@
                 <w:b w:val="0"/>
                 <w:sz w:val="15"/>
               </w:rPr>
-              <w:t>0.9735</w:t>
+              <w:t>0.9729</w:t>
             </w:r>
           </w:p>
         </w:tc>
@@ -1560,7 +1560,7 @@
                 <w:b w:val="0"/>
                 <w:sz w:val="15"/>
               </w:rPr>
-              <w:t>0.7869</w:t>
+              <w:t>0.7841</w:t>
             </w:r>
           </w:p>
         </w:tc>
@@ -1781,7 +1781,7 @@
                 <w:b w:val="0"/>
                 <w:sz w:val="15"/>
               </w:rPr>
-              <w:t>95.2%</w:t>
+              <w:t>93.8%</w:t>
             </w:r>
           </w:p>
         </w:tc>
@@ -1817,7 +1817,7 @@
                 <w:b w:val="0"/>
                 <w:sz w:val="15"/>
               </w:rPr>
-              <w:t>94.8%</w:t>
+              <w:t>93.5%</w:t>
             </w:r>
           </w:p>
         </w:tc>
@@ -1873,7 +1873,7 @@
                 <w:b w:val="0"/>
                 <w:sz w:val="15"/>
               </w:rPr>
-              <w:t>92.1%</w:t>
+              <w:t>89.4%</w:t>
             </w:r>
           </w:p>
         </w:tc>
@@ -1909,7 +1909,7 @@
                 <w:b w:val="0"/>
                 <w:sz w:val="15"/>
               </w:rPr>
-              <w:t>91.7%</w:t>
+              <w:t>89.3%</w:t>
             </w:r>
           </w:p>
         </w:tc>
@@ -2045,7 +2045,7 @@
                 <w:b w:val="0"/>
                 <w:sz w:val="15"/>
               </w:rPr>
-              <w:t>0.0378</w:t>
+              <w:t>0.0245</w:t>
             </w:r>
           </w:p>
         </w:tc>
@@ -2063,7 +2063,7 @@
                 <w:b w:val="0"/>
                 <w:sz w:val="15"/>
               </w:rPr>
-              <w:t>0.0424</w:t>
+              <w:t>0.0260</w:t>
             </w:r>
           </w:p>
         </w:tc>
@@ -2101,7 +2101,7 @@
                 <w:b w:val="0"/>
                 <w:sz w:val="15"/>
               </w:rPr>
-              <w:t>0.0547</w:t>
+              <w:t>0.0659</w:t>
             </w:r>
           </w:p>
         </w:tc>
@@ -2119,7 +2119,7 @@
                 <w:b w:val="0"/>
                 <w:sz w:val="15"/>
               </w:rPr>
-              <w:t>0.0589</w:t>
+              <w:t>0.0690</w:t>
             </w:r>
           </w:p>
         </w:tc>
@@ -2963,32 +2963,32 @@
     </w:p>
     <w:p>
       <w:r>
-        <w:t>☐ Master project DOCX generated and package-verified.</w:t>
+        <w:t>? Master project DOCX generated and package-verified.</w:t>
       </w:r>
     </w:p>
     <w:p>
       <w:r>
-        <w:t>☐ IEEE-style hard-copy paper generated and package-verified.</w:t>
+        <w:t>? IEEE-style hard-copy paper generated and package-verified.</w:t>
       </w:r>
     </w:p>
     <w:p>
       <w:r>
-        <w:t>☐ Mid-term progress report generated from the same training report.</w:t>
+        <w:t>? Mid-term progress report generated from the same training report.</w:t>
       </w:r>
     </w:p>
     <w:p>
       <w:r>
-        <w:t>☐ All chart source PNGs have automated blank/crop margin checks.</w:t>
+        <w:t>? All chart source PNGs have automated blank/crop margin checks.</w:t>
       </w:r>
     </w:p>
     <w:p>
       <w:r>
-        <w:t>☐ Human-study claims remain explicitly N=0 until responses exist.</w:t>
+        <w:t>? Human-study claims remain explicitly N=0 until responses exist.</w:t>
       </w:r>
     </w:p>
     <w:p>
       <w:r>
-        <w:t>☐ Team must bring a laptop, charger, backup copy, and printed hard copies.</w:t>
+        <w:t>? Team must bring a laptop, charger, backup copy, and printed hard copies.</w:t>
       </w:r>
     </w:p>
     <w:sectPr>

</xml_diff>